<commit_message>
feat(showUser):Méthode qui permet de supprimer un utilisateur
</commit_message>
<xml_diff>
--- a/P_294-PassionLectureRapport.docx
+++ b/P_294-PassionLectureRapport.docx
@@ -76,15 +76,7 @@
         <w:jc w:val="center"/>
       </w:pPr>
       <w:r>
-        <w:t xml:space="preserve">Elias </w:t>
-      </w:r>
-      <w:proofErr w:type="spellStart"/>
-      <w:r>
-        <w:t>Veya</w:t>
-      </w:r>
-      <w:proofErr w:type="spellEnd"/>
-      <w:r>
-        <w:t xml:space="preserve"> / Aaron Vichery</w:t>
+        <w:t>Elias Veya / Aaron Vichery</w:t>
       </w:r>
       <w:r>
         <w:t xml:space="preserve"> – </w:t>
@@ -114,13 +106,8 @@
         <w:jc w:val="center"/>
       </w:pPr>
       <w:r>
-        <w:t xml:space="preserve">Grégory </w:t>
+        <w:t>Grégory Charmier</w:t>
       </w:r>
-      <w:proofErr w:type="spellStart"/>
-      <w:r>
-        <w:t>Charmier</w:t>
-      </w:r>
-      <w:proofErr w:type="spellEnd"/>
     </w:p>
     <w:p>
       <w:pPr>
@@ -3744,9 +3731,9 @@
       <w:pPr>
         <w:pStyle w:val="Titre2"/>
       </w:pPr>
-      <w:bookmarkStart w:id="1" w:name="_Toc532179969"/>
-      <w:bookmarkStart w:id="2" w:name="_Toc165969639"/>
-      <w:bookmarkStart w:id="3" w:name="_Toc223680199"/>
+      <w:bookmarkStart w:id="1" w:name="_Toc223680199"/>
+      <w:bookmarkStart w:id="2" w:name="_Toc532179969"/>
+      <w:bookmarkStart w:id="3" w:name="_Toc165969639"/>
       <w:r>
         <w:t>T</w:t>
       </w:r>
@@ -3756,7 +3743,7 @@
       <w:r>
         <w:t>e</w:t>
       </w:r>
-      <w:bookmarkEnd w:id="3"/>
+      <w:bookmarkEnd w:id="1"/>
     </w:p>
     <w:p>
       <w:pPr>
@@ -3902,7 +3889,6 @@
           <w:szCs w:val="24"/>
         </w:rPr>
       </w:pPr>
-      <w:proofErr w:type="spellStart"/>
       <w:r>
         <w:rPr>
           <w:sz w:val="24"/>
@@ -3910,7 +3896,6 @@
         </w:rPr>
         <w:t>Figma</w:t>
       </w:r>
-      <w:proofErr w:type="spellEnd"/>
     </w:p>
     <w:p>
       <w:pPr>
@@ -3924,21 +3909,12 @@
           <w:szCs w:val="24"/>
         </w:rPr>
       </w:pPr>
-      <w:proofErr w:type="spellStart"/>
       <w:r>
         <w:rPr>
           <w:sz w:val="24"/>
           <w:szCs w:val="24"/>
         </w:rPr>
-        <w:t>MyJSON</w:t>
-      </w:r>
-      <w:proofErr w:type="spellEnd"/>
-      <w:r>
-        <w:rPr>
-          <w:sz w:val="24"/>
-          <w:szCs w:val="24"/>
-        </w:rPr>
-        <w:t xml:space="preserve"> server</w:t>
+        <w:t>MyJSON server</w:t>
       </w:r>
     </w:p>
     <w:p>
@@ -4010,8 +3986,8 @@
         <w:pStyle w:val="Titre1"/>
       </w:pPr>
       <w:bookmarkStart w:id="7" w:name="_Toc223680203"/>
-      <w:bookmarkEnd w:id="1"/>
       <w:bookmarkEnd w:id="2"/>
+      <w:bookmarkEnd w:id="3"/>
       <w:r>
         <w:t>Analyse</w:t>
       </w:r>
@@ -4117,7 +4093,7 @@
       </w:pPr>
       <w:bookmarkStart w:id="11" w:name="_Toc223680207"/>
       <w:r>
-        <w:t>Utilisateur simple</w:t>
+        <w:t>Utilisateur</w:t>
       </w:r>
       <w:bookmarkEnd w:id="11"/>
     </w:p>
@@ -4177,15 +4153,7 @@
         <w:pStyle w:val="Retraitcorpsdetexte3"/>
       </w:pPr>
       <w:r>
-        <w:t xml:space="preserve">Sur cette page, nous voyons les </w:t>
-      </w:r>
-      <w:proofErr w:type="spellStart"/>
-      <w:r>
-        <w:t>details</w:t>
-      </w:r>
-      <w:proofErr w:type="spellEnd"/>
-      <w:r>
-        <w:t xml:space="preserve"> du livre que nous avons sélectionné.</w:t>
+        <w:t>Sur cette page, nous voyons les details du livre que nous avons sélectionné.</w:t>
       </w:r>
     </w:p>
     <w:p>
@@ -4309,7 +4277,7 @@
           <w:noProof/>
         </w:rPr>
         <w:drawing>
-          <wp:inline distT="0" distB="0" distL="0" distR="0" wp14:anchorId="74940CEA" wp14:editId="61E0E5E6">
+          <wp:inline distT="0" distB="0" distL="0" distR="0" wp14:anchorId="74940CEA" wp14:editId="192B808A">
             <wp:extent cx="4060046" cy="1976754"/>
             <wp:effectExtent l="0" t="0" r="0" b="5080"/>
             <wp:docPr id="306827612" name="Image 7" descr="Une image contenant texte, capture d’écran, Police, carte de visite"/>
@@ -4432,15 +4400,7 @@
         <w:pStyle w:val="Retraitcorpsdetexte3"/>
       </w:pPr>
       <w:r>
-        <w:t xml:space="preserve">Sur cette page, nous pouvons voir les informations sur l’utilisateur, mais nous pouvons également accéder aux livres qu’il a publié </w:t>
-      </w:r>
-      <w:proofErr w:type="gramStart"/>
-      <w:r>
-        <w:t>ou</w:t>
-      </w:r>
-      <w:proofErr w:type="gramEnd"/>
-      <w:r>
-        <w:t xml:space="preserve"> supprimer son compte.</w:t>
+        <w:t>Sur cette page, nous pouvons voir les informations sur l’utilisateur, mais nous pouvons également accéder aux livres qu’il a publié ou supprimer son compte.</w:t>
       </w:r>
     </w:p>
     <w:p>
@@ -4467,7 +4427,7 @@
           <w:noProof/>
         </w:rPr>
         <w:drawing>
-          <wp:inline distT="0" distB="0" distL="0" distR="0" wp14:anchorId="1B5D94A6" wp14:editId="36BF3F01">
+          <wp:inline distT="0" distB="0" distL="0" distR="0" wp14:anchorId="1B5D94A6" wp14:editId="01C5B7DE">
             <wp:extent cx="4715654" cy="3656062"/>
             <wp:effectExtent l="0" t="0" r="8890" b="1905"/>
             <wp:docPr id="1573168060" name="Image 9" descr="Une image contenant texte, capture d’écran, boîte, livre&#10;&#10;Le contenu généré par l’IA peut être incorrect."/>
@@ -4540,7 +4500,7 @@
           <w:noProof/>
         </w:rPr>
         <w:drawing>
-          <wp:inline distT="0" distB="0" distL="0" distR="0" wp14:anchorId="29BDF753" wp14:editId="75BB8A8D">
+          <wp:inline distT="0" distB="0" distL="0" distR="0" wp14:anchorId="29BDF753" wp14:editId="0B0CB699">
             <wp:extent cx="5000326" cy="3012324"/>
             <wp:effectExtent l="0" t="0" r="0" b="0"/>
             <wp:docPr id="786029671" name="Image 10" descr="Une image contenant texte, capture d’écran, livre, boîte"/>
@@ -4610,7 +4570,7 @@
           <w:noProof/>
         </w:rPr>
         <w:drawing>
-          <wp:inline distT="0" distB="0" distL="0" distR="0" wp14:anchorId="47B3BF99" wp14:editId="1BC528D1">
+          <wp:inline distT="0" distB="0" distL="0" distR="0" wp14:anchorId="47B3BF99" wp14:editId="73331DD7">
             <wp:extent cx="4439609" cy="2497341"/>
             <wp:effectExtent l="0" t="0" r="0" b="0"/>
             <wp:docPr id="606781714" name="Image 11" descr="Une image contenant texte, capture d’écran, nombre, Police"/>
@@ -4657,15 +4617,7 @@
         <w:pStyle w:val="Retraitcorpsdetexte3"/>
       </w:pPr>
       <w:r>
-        <w:t xml:space="preserve">Cette page affiche tous les livres publiés sur le site, nous pouvons voir les différentes catégories de livres </w:t>
-      </w:r>
-      <w:proofErr w:type="spellStart"/>
-      <w:r>
-        <w:t>au dessus</w:t>
-      </w:r>
-      <w:proofErr w:type="spellEnd"/>
-      <w:r>
-        <w:t xml:space="preserve"> afin de filtrer notre recherche, pour chaque livre, est affiché le titre, le nom de l’auteur et le nom de l’utilisateur ayant publié le livre.</w:t>
+        <w:t>Cette page affiche tous les livres publiés sur le site, nous pouvons voir les différentes catégories de livres au dessus afin de filtrer notre recherche, pour chaque livre, est affiché le titre, le nom de l’auteur et le nom de l’utilisateur ayant publié le livre.</w:t>
       </w:r>
     </w:p>
     <w:p>
@@ -4687,7 +4639,7 @@
           <w:noProof/>
         </w:rPr>
         <w:drawing>
-          <wp:inline distT="0" distB="0" distL="0" distR="0" wp14:anchorId="747BE459" wp14:editId="310B5B95">
+          <wp:inline distT="0" distB="0" distL="0" distR="0" wp14:anchorId="747BE459" wp14:editId="51A2F238">
             <wp:extent cx="4569005" cy="2788755"/>
             <wp:effectExtent l="0" t="0" r="3175" b="0"/>
             <wp:docPr id="875770135" name="Image 12" descr="Une image contenant texte, capture d’écran, nombre, Police"/>
@@ -4837,7 +4789,7 @@
           <w:noProof/>
         </w:rPr>
         <w:drawing>
-          <wp:inline distT="0" distB="0" distL="0" distR="0" wp14:anchorId="52F0D62C" wp14:editId="6A5A9B79">
+          <wp:inline distT="0" distB="0" distL="0" distR="0" wp14:anchorId="52F0D62C" wp14:editId="3531C6C3">
             <wp:extent cx="1765738" cy="2906638"/>
             <wp:effectExtent l="0" t="0" r="6350" b="8255"/>
             <wp:docPr id="1553494395" name="Image 1" descr="Une image contenant texte, capture d’écran, Police, logo&#10;&#10;Le contenu généré par l’IA peut être incorrect."/>
@@ -4885,45 +4837,16 @@
       </w:pPr>
       <w:bookmarkStart w:id="23" w:name="_Toc223680220"/>
       <w:r>
-        <w:t xml:space="preserve">Product </w:t>
-      </w:r>
-      <w:proofErr w:type="spellStart"/>
-      <w:r>
-        <w:t>Backlog</w:t>
+        <w:t>Product Backlog</w:t>
       </w:r>
       <w:bookmarkEnd w:id="23"/>
-      <w:proofErr w:type="spellEnd"/>
     </w:p>
     <w:p>
       <w:pPr>
         <w:pStyle w:val="Retraitcorpsdetexte3"/>
       </w:pPr>
       <w:r>
-        <w:t xml:space="preserve">Le </w:t>
-      </w:r>
-      <w:proofErr w:type="spellStart"/>
-      <w:r>
-        <w:t>product</w:t>
-      </w:r>
-      <w:proofErr w:type="spellEnd"/>
-      <w:r>
-        <w:t xml:space="preserve"> </w:t>
-      </w:r>
-      <w:proofErr w:type="spellStart"/>
-      <w:r>
-        <w:t>Backlog</w:t>
-      </w:r>
-      <w:proofErr w:type="spellEnd"/>
-      <w:r>
-        <w:t xml:space="preserve"> correspond à notre </w:t>
-      </w:r>
-      <w:proofErr w:type="spellStart"/>
-      <w:r>
-        <w:t>Github</w:t>
-      </w:r>
-      <w:proofErr w:type="spellEnd"/>
-      <w:r>
-        <w:t xml:space="preserve"> Project.</w:t>
+        <w:t>Le product Backlog correspond à notre Github Project.</w:t>
       </w:r>
     </w:p>
     <w:p>
@@ -5485,21 +5408,12 @@
               <w:szCs w:val="16"/>
             </w:rPr>
           </w:pPr>
-          <w:proofErr w:type="gramStart"/>
           <w:r>
             <w:rPr>
               <w:rFonts w:cs="Arial"/>
               <w:szCs w:val="16"/>
             </w:rPr>
-            <w:t>Version:</w:t>
-          </w:r>
-          <w:proofErr w:type="gramEnd"/>
-          <w:r>
-            <w:rPr>
-              <w:rFonts w:cs="Arial"/>
-              <w:szCs w:val="16"/>
-            </w:rPr>
-            <w:t xml:space="preserve"> </w:t>
+            <w:t xml:space="preserve">Version: </w:t>
           </w:r>
           <w:fldSimple w:instr=" REVNUM   \* MERGEFORMAT ">
             <w:r>
@@ -5545,7 +5459,7 @@
               <w:noProof/>
               <w:szCs w:val="16"/>
             </w:rPr>
-            <w:t>11.02.2026 11:19</w:t>
+            <w:t>06.03.2026 11:24</w:t>
           </w:r>
           <w:r>
             <w:rPr>
@@ -5757,7 +5671,7 @@
         <v:path o:extrusionok="f" gradientshapeok="t" o:connecttype="rect"/>
         <o:lock v:ext="edit" aspectratio="t"/>
       </v:shapetype>
-      <v:shape id="_x0000_i1033" type="#_x0000_t75" style="width:10.9pt;height:10.9pt" o:bullet="t">
+      <v:shape id="_x0000_i1030" type="#_x0000_t75" style="width:11.25pt;height:11.25pt" o:bullet="t">
         <v:imagedata r:id="rId1" o:title="BD10263_"/>
       </v:shape>
     </w:pict>
@@ -10801,6 +10715,12 @@
 </file>
 
 <file path=customXml/item1.xml><?xml version="1.0" encoding="utf-8"?>
+<p:properties xmlns:p="http://schemas.microsoft.com/office/2006/metadata/properties" xmlns:xsi="http://www.w3.org/2001/XMLSchema-instance" xmlns:pc="http://schemas.microsoft.com/office/infopath/2007/PartnerControls">
+  <documentManagement/>
+</p:properties>
+</file>
+
+<file path=customXml/item2.xml><?xml version="1.0" encoding="utf-8"?>
 <ct:contentTypeSchema xmlns:ct="http://schemas.microsoft.com/office/2006/metadata/contentType" xmlns:ma="http://schemas.microsoft.com/office/2006/metadata/properties/metaAttributes" ct:_="" ma:_="" ma:contentTypeName="Document" ma:contentTypeID="0x010100DE9925070658E9408BDD6D38957EA443" ma:contentTypeVersion="3" ma:contentTypeDescription="Crée un document." ma:contentTypeScope="" ma:versionID="33b0460ac9ea0143869e0a72728eb9f6">
   <xsd:schema xmlns:xsd="http://www.w3.org/2001/XMLSchema" xmlns:xs="http://www.w3.org/2001/XMLSchema" xmlns:p="http://schemas.microsoft.com/office/2006/metadata/properties" xmlns:ns2="accb4b95-b0ac-445b-9850-8c8f81e8b17d" targetNamespace="http://schemas.microsoft.com/office/2006/metadata/properties" ma:root="true" ma:fieldsID="5c8c88271c639fadac3e9b0b051c153e" ns2:_="">
     <xsd:import namespace="accb4b95-b0ac-445b-9850-8c8f81e8b17d"/>
@@ -10938,17 +10858,7 @@
 </ct:contentTypeSchema>
 </file>
 
-<file path=customXml/item2.xml><?xml version="1.0" encoding="utf-8"?>
-<p:properties xmlns:p="http://schemas.microsoft.com/office/2006/metadata/properties" xmlns:xsi="http://www.w3.org/2001/XMLSchema-instance" xmlns:pc="http://schemas.microsoft.com/office/infopath/2007/PartnerControls">
-  <documentManagement/>
-</p:properties>
-</file>
-
 <file path=customXml/item3.xml><?xml version="1.0" encoding="utf-8"?>
-<b:Sources xmlns:b="http://schemas.openxmlformats.org/officeDocument/2006/bibliography" xmlns="http://schemas.openxmlformats.org/officeDocument/2006/bibliography" SelectedStyle="\APA.XSL" StyleName="APA"/>
-</file>
-
-<file path=customXml/item4.xml><?xml version="1.0" encoding="utf-8"?>
 <?mso-contentType ?>
 <FormTemplates xmlns="http://schemas.microsoft.com/sharepoint/v3/contenttype/forms">
   <Display>DocumentLibraryForm</Display>
@@ -10957,7 +10867,20 @@
 </FormTemplates>
 </file>
 
+<file path=customXml/item4.xml><?xml version="1.0" encoding="utf-8"?>
+<b:Sources xmlns:b="http://schemas.openxmlformats.org/officeDocument/2006/bibliography" xmlns="http://schemas.openxmlformats.org/officeDocument/2006/bibliography" SelectedStyle="\APA.XSL" StyleName="APA"/>
+</file>
+
 <file path=customXml/itemProps1.xml><?xml version="1.0" encoding="utf-8"?>
+<ds:datastoreItem xmlns:ds="http://schemas.openxmlformats.org/officeDocument/2006/customXml" ds:itemID="{2319CDB8-A2CD-412D-8359-13E6B4DF1FF4}">
+  <ds:schemaRefs>
+    <ds:schemaRef ds:uri="http://schemas.microsoft.com/office/2006/metadata/properties"/>
+    <ds:schemaRef ds:uri="http://schemas.microsoft.com/office/infopath/2007/PartnerControls"/>
+  </ds:schemaRefs>
+</ds:datastoreItem>
+</file>
+
+<file path=customXml/itemProps2.xml><?xml version="1.0" encoding="utf-8"?>
 <ds:datastoreItem xmlns:ds="http://schemas.openxmlformats.org/officeDocument/2006/customXml" ds:itemID="{83F63AF2-685C-4234-8023-CA4629C17CE3}">
   <ds:schemaRefs>
     <ds:schemaRef ds:uri="http://schemas.microsoft.com/office/2006/metadata/contentType"/>
@@ -10975,27 +10898,18 @@
 </ds:datastoreItem>
 </file>
 
-<file path=customXml/itemProps2.xml><?xml version="1.0" encoding="utf-8"?>
-<ds:datastoreItem xmlns:ds="http://schemas.openxmlformats.org/officeDocument/2006/customXml" ds:itemID="{2319CDB8-A2CD-412D-8359-13E6B4DF1FF4}">
+<file path=customXml/itemProps3.xml><?xml version="1.0" encoding="utf-8"?>
+<ds:datastoreItem xmlns:ds="http://schemas.openxmlformats.org/officeDocument/2006/customXml" ds:itemID="{6C3F7A66-EDE3-46FD-83EB-3C265E5D2669}">
   <ds:schemaRefs>
-    <ds:schemaRef ds:uri="http://schemas.microsoft.com/office/2006/metadata/properties"/>
-    <ds:schemaRef ds:uri="http://schemas.microsoft.com/office/infopath/2007/PartnerControls"/>
+    <ds:schemaRef ds:uri="http://schemas.microsoft.com/sharepoint/v3/contenttype/forms"/>
   </ds:schemaRefs>
 </ds:datastoreItem>
 </file>
 
-<file path=customXml/itemProps3.xml><?xml version="1.0" encoding="utf-8"?>
+<file path=customXml/itemProps4.xml><?xml version="1.0" encoding="utf-8"?>
 <ds:datastoreItem xmlns:ds="http://schemas.openxmlformats.org/officeDocument/2006/customXml" ds:itemID="{C8C35155-3E6A-4058-B6E4-303717845E3B}">
   <ds:schemaRefs>
     <ds:schemaRef ds:uri="http://schemas.openxmlformats.org/officeDocument/2006/bibliography"/>
   </ds:schemaRefs>
 </ds:datastoreItem>
-</file>
-
-<file path=customXml/itemProps4.xml><?xml version="1.0" encoding="utf-8"?>
-<ds:datastoreItem xmlns:ds="http://schemas.openxmlformats.org/officeDocument/2006/customXml" ds:itemID="{6C3F7A66-EDE3-46FD-83EB-3C265E5D2669}">
-  <ds:schemaRefs>
-    <ds:schemaRef ds:uri="http://schemas.microsoft.com/sharepoint/v3/contenttype/forms"/>
-  </ds:schemaRefs>
-</ds:datastoreItem>
 </file>
</xml_diff>